<commit_message>
Texto escrito pelo sistema nas pecas sem travessao (skill jusmanizer, J01); teste-guarda de estilo; minutas regeneradas
Co-Authored-By: Claude Sonnet 5.5 <noreply@anthropic.com>
</commit_message>
<xml_diff>
--- a/templates/pecas/minutas-para-revisao/Minuta_Revisao_PGFN_decadencia.docx
+++ b/templates/pecas/minutas-para-revisao/Minuta_Revisao_PGFN_decadencia.docx
@@ -3644,7 +3644,7 @@
                 <w:sz w:val="21"/>
                 <w:szCs w:val="21"/>
               </w:rPr>
-              <w:t xml:space="preserve">Fato gerador — período 2005</w:t>
+              <w:t xml:space="preserve">Fato gerador do período 2005</w:t>
             </w:r>
           </w:p>
         </w:tc>
@@ -3739,7 +3739,7 @@
                 <w:sz w:val="21"/>
                 <w:szCs w:val="21"/>
               </w:rPr>
-              <w:t xml:space="preserve">Marco inicial do prazo decadencial — período 2005 (Art. 173, I, CTN)</w:t>
+              <w:t xml:space="preserve">Marco inicial do prazo decadencial do período 2005 (Art. 173, I, CTN)</w:t>
             </w:r>
           </w:p>
         </w:tc>
@@ -3834,7 +3834,7 @@
                 <w:sz w:val="21"/>
                 <w:szCs w:val="21"/>
               </w:rPr>
-              <w:t xml:space="preserve">Fato gerador — período 2006</w:t>
+              <w:t xml:space="preserve">Fato gerador do período 2006</w:t>
             </w:r>
           </w:p>
         </w:tc>
@@ -3929,7 +3929,7 @@
                 <w:sz w:val="21"/>
                 <w:szCs w:val="21"/>
               </w:rPr>
-              <w:t xml:space="preserve">Marco inicial do prazo decadencial — período 2006 (Art. 150, § 4º, CTN)</w:t>
+              <w:t xml:space="preserve">Marco inicial do prazo decadencial do período 2006 (Art. 150, § 4º, CTN)</w:t>
             </w:r>
           </w:p>
         </w:tc>
@@ -4024,7 +4024,7 @@
                 <w:sz w:val="21"/>
                 <w:szCs w:val="21"/>
               </w:rPr>
-              <w:t xml:space="preserve">Termo final do prazo decadencial — período 2005</w:t>
+              <w:t xml:space="preserve">Termo final do prazo decadencial do período 2005</w:t>
             </w:r>
           </w:p>
         </w:tc>
@@ -4119,7 +4119,7 @@
                 <w:sz w:val="21"/>
                 <w:szCs w:val="21"/>
               </w:rPr>
-              <w:t xml:space="preserve">Termo final do prazo decadencial — período 2006</w:t>
+              <w:t xml:space="preserve">Termo final do prazo decadencial do período 2006</w:t>
             </w:r>
           </w:p>
         </w:tc>
@@ -4214,7 +4214,7 @@
                 <w:sz w:val="21"/>
                 <w:szCs w:val="21"/>
               </w:rPr>
-              <w:t xml:space="preserve">Notificação do lançamento — período 2005</w:t>
+              <w:t xml:space="preserve">Notificação do lançamento do período 2005</w:t>
             </w:r>
           </w:p>
         </w:tc>
@@ -4309,7 +4309,7 @@
                 <w:sz w:val="21"/>
                 <w:szCs w:val="21"/>
               </w:rPr>
-              <w:t xml:space="preserve">Notificação do lançamento — período 2006</w:t>
+              <w:t xml:space="preserve">Notificação do lançamento do período 2006</w:t>
             </w:r>
           </w:p>
         </w:tc>

</xml_diff>